<commit_message>
fixed BRD generation issues provided by BA team, added light mode to the website
</commit_message>
<xml_diff>
--- a/backend/brd_service/templates/BRD-Template.docx
+++ b/backend/brd_service/templates/BRD-Template.docx
@@ -11,11 +11,11 @@
           <w:szCs w:val="24"/>
         </w:rPr>
       </w:pPr>
-      <w:bookmarkStart w:id="0" w:name="_Toc416400122"/>
-      <w:bookmarkStart w:id="1" w:name="_Toc409599499"/>
-      <w:bookmarkStart w:id="2" w:name="_Toc416195988"/>
-      <w:bookmarkStart w:id="3" w:name="_Toc420326477"/>
-      <w:bookmarkStart w:id="4" w:name="_Toc412034490"/>
+      <w:bookmarkStart w:id="0" w:name="_Toc412034490"/>
+      <w:bookmarkStart w:id="1" w:name="_Toc416195988"/>
+      <w:bookmarkStart w:id="2" w:name="_Toc416400122"/>
+      <w:bookmarkStart w:id="3" w:name="_Toc409599499"/>
+      <w:bookmarkStart w:id="4" w:name="_Toc420326477"/>
     </w:p>
     <w:p>
       <w:pPr>
@@ -431,8 +431,6 @@
             </w:rPr>
             <w:fldChar w:fldCharType="end"/>
           </w:r>
-          <w:bookmarkStart w:id="194" w:name="_GoBack"/>
-          <w:bookmarkEnd w:id="194"/>
         </w:p>
       </w:sdtContent>
     </w:sdt>
@@ -450,8 +448,8 @@
         </w:rPr>
       </w:pPr>
       <w:bookmarkStart w:id="6" w:name="_Toc202362079"/>
-      <w:bookmarkStart w:id="7" w:name="_Toc411802248"/>
-      <w:bookmarkStart w:id="8" w:name="_Toc414298017"/>
+      <w:bookmarkStart w:id="7" w:name="_Toc414298017"/>
+      <w:bookmarkStart w:id="8" w:name="_Toc411802248"/>
       <w:r>
         <w:rPr>
           <w:rFonts w:cstheme="minorHAnsi"/>
@@ -1439,9 +1437,9 @@
         </w:rPr>
       </w:pPr>
       <w:bookmarkStart w:id="10" w:name="_Toc414298018"/>
-      <w:bookmarkStart w:id="11" w:name="_Toc402806931"/>
+      <w:bookmarkStart w:id="11" w:name="_Toc411802249"/>
       <w:bookmarkStart w:id="12" w:name="_Toc403416452"/>
-      <w:bookmarkStart w:id="13" w:name="_Toc411802249"/>
+      <w:bookmarkStart w:id="13" w:name="_Toc402806931"/>
       <w:r>
         <w:rPr>
           <w:rFonts w:cstheme="minorHAnsi"/>
@@ -1663,6 +1661,12 @@
             <w:insideH w:val="single" w:color="5B9BD5" w:themeColor="accent1" w:sz="4" w:space="0"/>
             <w:insideV w:val="single" w:color="5B9BD5" w:themeColor="accent1" w:sz="4" w:space="0"/>
           </w:tblBorders>
+          <w:tblCellMar>
+            <w:top w:w="0" w:type="dxa"/>
+            <w:left w:w="108" w:type="dxa"/>
+            <w:bottom w:w="0" w:type="dxa"/>
+            <w:right w:w="108" w:type="dxa"/>
+          </w:tblCellMar>
         </w:tblPrEx>
         <w:trPr>
           <w:trHeight w:val="413" w:hRule="atLeast"/>
@@ -2049,6 +2053,12 @@
             <w:insideH w:val="single" w:color="5B9BD5" w:themeColor="accent1" w:sz="4" w:space="0"/>
             <w:insideV w:val="single" w:color="5B9BD5" w:themeColor="accent1" w:sz="4" w:space="0"/>
           </w:tblBorders>
+          <w:tblCellMar>
+            <w:top w:w="0" w:type="dxa"/>
+            <w:left w:w="108" w:type="dxa"/>
+            <w:bottom w:w="0" w:type="dxa"/>
+            <w:right w:w="108" w:type="dxa"/>
+          </w:tblCellMar>
         </w:tblPrEx>
         <w:trPr>
           <w:trHeight w:val="413" w:hRule="atLeast"/>
@@ -2239,6 +2249,12 @@
             <w:insideH w:val="single" w:color="5B9BD5" w:themeColor="accent1" w:sz="4" w:space="0"/>
             <w:insideV w:val="single" w:color="5B9BD5" w:themeColor="accent1" w:sz="4" w:space="0"/>
           </w:tblBorders>
+          <w:tblCellMar>
+            <w:top w:w="0" w:type="dxa"/>
+            <w:left w:w="108" w:type="dxa"/>
+            <w:bottom w:w="0" w:type="dxa"/>
+            <w:right w:w="108" w:type="dxa"/>
+          </w:tblCellMar>
         </w:tblPrEx>
         <w:trPr>
           <w:trHeight w:val="413" w:hRule="atLeast"/>
@@ -3543,6 +3559,12 @@
             <w:insideH w:val="single" w:color="auto" w:sz="4" w:space="0"/>
             <w:insideV w:val="single" w:color="auto" w:sz="4" w:space="0"/>
           </w:tblBorders>
+          <w:tblCellMar>
+            <w:top w:w="0" w:type="dxa"/>
+            <w:left w:w="108" w:type="dxa"/>
+            <w:bottom w:w="0" w:type="dxa"/>
+            <w:right w:w="108" w:type="dxa"/>
+          </w:tblCellMar>
         </w:tblPrEx>
         <w:trPr>
           <w:trHeight w:val="278" w:hRule="atLeast"/>
@@ -3811,6 +3833,12 @@
             <w:insideH w:val="single" w:color="auto" w:sz="4" w:space="0"/>
             <w:insideV w:val="single" w:color="auto" w:sz="4" w:space="0"/>
           </w:tblBorders>
+          <w:tblCellMar>
+            <w:top w:w="0" w:type="dxa"/>
+            <w:left w:w="108" w:type="dxa"/>
+            <w:bottom w:w="0" w:type="dxa"/>
+            <w:right w:w="108" w:type="dxa"/>
+          </w:tblCellMar>
         </w:tblPrEx>
         <w:trPr>
           <w:trHeight w:val="323" w:hRule="atLeast"/>
@@ -6590,23 +6618,23 @@
           <w:lang w:val="en-US"/>
         </w:rPr>
       </w:pPr>
-      <w:bookmarkStart w:id="31" w:name="_Toc460840039"/>
+      <w:bookmarkStart w:id="31" w:name="_Toc460835607"/>
       <w:bookmarkEnd w:id="31"/>
-      <w:bookmarkStart w:id="32" w:name="_Toc460681399"/>
+      <w:bookmarkStart w:id="32" w:name="_Toc460833977"/>
       <w:bookmarkEnd w:id="32"/>
-      <w:bookmarkStart w:id="33" w:name="_Toc460835607"/>
+      <w:bookmarkStart w:id="33" w:name="_Toc460849338"/>
       <w:bookmarkEnd w:id="33"/>
-      <w:bookmarkStart w:id="34" w:name="_Toc460833977"/>
+      <w:bookmarkStart w:id="34" w:name="_Toc460833936"/>
       <w:bookmarkEnd w:id="34"/>
-      <w:bookmarkStart w:id="35" w:name="_Toc460849338"/>
+      <w:bookmarkStart w:id="35" w:name="_Toc460834270"/>
       <w:bookmarkEnd w:id="35"/>
-      <w:bookmarkStart w:id="36" w:name="_Toc460834270"/>
+      <w:bookmarkStart w:id="36" w:name="_Toc460837890"/>
       <w:bookmarkEnd w:id="36"/>
-      <w:bookmarkStart w:id="37" w:name="_Toc460833936"/>
+      <w:bookmarkStart w:id="37" w:name="_Toc460681355"/>
       <w:bookmarkEnd w:id="37"/>
-      <w:bookmarkStart w:id="38" w:name="_Toc460837890"/>
+      <w:bookmarkStart w:id="38" w:name="_Toc460681399"/>
       <w:bookmarkEnd w:id="38"/>
-      <w:bookmarkStart w:id="39" w:name="_Toc460681355"/>
+      <w:bookmarkStart w:id="39" w:name="_Toc460840039"/>
       <w:bookmarkEnd w:id="39"/>
       <w:r>
         <w:rPr>
@@ -6736,77 +6764,77 @@
           <w:szCs w:val="32"/>
         </w:rPr>
       </w:pPr>
-      <w:bookmarkStart w:id="40" w:name="_Toc184836049"/>
+      <w:bookmarkStart w:id="40" w:name="_Toc460837891"/>
       <w:bookmarkEnd w:id="40"/>
-      <w:bookmarkStart w:id="41" w:name="_Toc460833937"/>
+      <w:bookmarkStart w:id="41" w:name="_Toc460840040"/>
       <w:bookmarkEnd w:id="41"/>
-      <w:bookmarkStart w:id="42" w:name="_Toc490837357"/>
+      <w:bookmarkStart w:id="42" w:name="_Toc16935018"/>
       <w:bookmarkEnd w:id="42"/>
-      <w:bookmarkStart w:id="43" w:name="_Toc460681356"/>
+      <w:bookmarkStart w:id="43" w:name="_Toc460833978"/>
       <w:bookmarkEnd w:id="43"/>
-      <w:bookmarkStart w:id="44" w:name="_Toc490838067"/>
+      <w:bookmarkStart w:id="44" w:name="_Toc460681400"/>
       <w:bookmarkEnd w:id="44"/>
-      <w:bookmarkStart w:id="45" w:name="_Toc460681400"/>
+      <w:bookmarkStart w:id="45" w:name="_Toc11836602"/>
       <w:bookmarkEnd w:id="45"/>
-      <w:bookmarkStart w:id="46" w:name="_Toc11688486"/>
+      <w:bookmarkStart w:id="46" w:name="_Toc76036213"/>
       <w:bookmarkEnd w:id="46"/>
-      <w:bookmarkStart w:id="47" w:name="_Toc16935018"/>
+      <w:bookmarkStart w:id="47" w:name="_Toc460835608"/>
       <w:bookmarkEnd w:id="47"/>
-      <w:bookmarkStart w:id="48" w:name="_Toc460833978"/>
+      <w:bookmarkStart w:id="48" w:name="_Toc460833937"/>
       <w:bookmarkEnd w:id="48"/>
-      <w:bookmarkStart w:id="49" w:name="_Toc460834271"/>
+      <w:bookmarkStart w:id="49" w:name="_Toc490838067"/>
       <w:bookmarkEnd w:id="49"/>
-      <w:bookmarkStart w:id="50" w:name="_Toc460837891"/>
+      <w:bookmarkStart w:id="50" w:name="_Toc11688486"/>
       <w:bookmarkEnd w:id="50"/>
-      <w:bookmarkStart w:id="51" w:name="_Toc460840040"/>
+      <w:bookmarkStart w:id="51" w:name="_Toc184836049"/>
       <w:bookmarkEnd w:id="51"/>
-      <w:bookmarkStart w:id="52" w:name="_Toc11836602"/>
+      <w:bookmarkStart w:id="52" w:name="_Toc490837357"/>
       <w:bookmarkEnd w:id="52"/>
-      <w:bookmarkStart w:id="53" w:name="_Toc76036213"/>
+      <w:bookmarkStart w:id="53" w:name="_Toc460681356"/>
       <w:bookmarkEnd w:id="53"/>
-      <w:bookmarkStart w:id="54" w:name="_Toc460835608"/>
+      <w:bookmarkStart w:id="54" w:name="_Toc460834271"/>
       <w:bookmarkEnd w:id="54"/>
-      <w:bookmarkStart w:id="55" w:name="_Toc76036249"/>
+      <w:bookmarkStart w:id="55" w:name="_Toc490738289"/>
       <w:bookmarkEnd w:id="55"/>
-      <w:bookmarkStart w:id="56" w:name="_Toc460849339"/>
+      <w:bookmarkStart w:id="56" w:name="_Toc490737756"/>
       <w:bookmarkEnd w:id="56"/>
-      <w:bookmarkStart w:id="57" w:name="_Toc13487949"/>
+      <w:bookmarkStart w:id="57" w:name="_Toc490737734"/>
       <w:bookmarkEnd w:id="57"/>
-      <w:bookmarkStart w:id="58" w:name="_Toc184835953"/>
+      <w:bookmarkStart w:id="58" w:name="_Toc202362059"/>
       <w:bookmarkEnd w:id="58"/>
-      <w:bookmarkStart w:id="59" w:name="_Toc490738289"/>
+      <w:bookmarkStart w:id="59" w:name="_Toc184916771"/>
       <w:bookmarkEnd w:id="59"/>
-      <w:bookmarkStart w:id="60" w:name="_Toc11687282"/>
+      <w:bookmarkStart w:id="60" w:name="_Toc184916704"/>
       <w:bookmarkEnd w:id="60"/>
-      <w:bookmarkStart w:id="61" w:name="_Toc490837050"/>
+      <w:bookmarkStart w:id="61" w:name="_Toc490817196"/>
       <w:bookmarkEnd w:id="61"/>
-      <w:bookmarkStart w:id="62" w:name="_Toc490817345"/>
+      <w:bookmarkStart w:id="62" w:name="_Toc76036249"/>
       <w:bookmarkEnd w:id="62"/>
-      <w:bookmarkStart w:id="63" w:name="_Toc490838189"/>
+      <w:bookmarkStart w:id="63" w:name="_Toc13487949"/>
       <w:bookmarkEnd w:id="63"/>
-      <w:bookmarkStart w:id="64" w:name="_Toc490737756"/>
+      <w:bookmarkStart w:id="64" w:name="_Toc490817345"/>
       <w:bookmarkEnd w:id="64"/>
-      <w:bookmarkStart w:id="65" w:name="_Toc490817196"/>
+      <w:bookmarkStart w:id="65" w:name="_Toc16935084"/>
       <w:bookmarkEnd w:id="65"/>
-      <w:bookmarkStart w:id="66" w:name="_Toc11687315"/>
+      <w:bookmarkStart w:id="66" w:name="_Toc202362097"/>
       <w:bookmarkEnd w:id="66"/>
-      <w:bookmarkStart w:id="67" w:name="_Toc13492529"/>
+      <w:bookmarkStart w:id="67" w:name="_Toc490837026"/>
       <w:bookmarkEnd w:id="67"/>
-      <w:bookmarkStart w:id="68" w:name="_Toc490737734"/>
+      <w:bookmarkStart w:id="68" w:name="_Toc184835953"/>
       <w:bookmarkEnd w:id="68"/>
-      <w:bookmarkStart w:id="69" w:name="_Toc490837026"/>
+      <w:bookmarkStart w:id="69" w:name="_Toc460849339"/>
       <w:bookmarkEnd w:id="69"/>
-      <w:bookmarkStart w:id="70" w:name="_Toc16935084"/>
+      <w:bookmarkStart w:id="70" w:name="_Toc11687282"/>
       <w:bookmarkEnd w:id="70"/>
-      <w:bookmarkStart w:id="71" w:name="_Toc184836001"/>
+      <w:bookmarkStart w:id="71" w:name="_Toc490837050"/>
       <w:bookmarkEnd w:id="71"/>
-      <w:bookmarkStart w:id="72" w:name="_Toc184916704"/>
+      <w:bookmarkStart w:id="72" w:name="_Toc13492529"/>
       <w:bookmarkEnd w:id="72"/>
-      <w:bookmarkStart w:id="73" w:name="_Toc202362097"/>
+      <w:bookmarkStart w:id="73" w:name="_Toc184836001"/>
       <w:bookmarkEnd w:id="73"/>
-      <w:bookmarkStart w:id="74" w:name="_Toc202362059"/>
+      <w:bookmarkStart w:id="74" w:name="_Toc11687315"/>
       <w:bookmarkEnd w:id="74"/>
-      <w:bookmarkStart w:id="75" w:name="_Toc184916771"/>
+      <w:bookmarkStart w:id="75" w:name="_Toc490838189"/>
       <w:bookmarkEnd w:id="75"/>
     </w:p>
     <w:p>
@@ -6834,73 +6862,73 @@
       <w:bookmarkEnd w:id="76"/>
       <w:bookmarkStart w:id="77" w:name="_Toc460833938"/>
       <w:bookmarkEnd w:id="77"/>
-      <w:bookmarkStart w:id="78" w:name="_Toc460833979"/>
+      <w:bookmarkStart w:id="78" w:name="_Toc460840041"/>
       <w:bookmarkEnd w:id="78"/>
-      <w:bookmarkStart w:id="79" w:name="_Toc460837892"/>
+      <w:bookmarkStart w:id="79" w:name="_Toc460833979"/>
       <w:bookmarkEnd w:id="79"/>
-      <w:bookmarkStart w:id="80" w:name="_Toc460840041"/>
+      <w:bookmarkStart w:id="80" w:name="_Toc460849340"/>
       <w:bookmarkEnd w:id="80"/>
-      <w:bookmarkStart w:id="81" w:name="_Toc460834272"/>
+      <w:bookmarkStart w:id="81" w:name="_Toc490737757"/>
       <w:bookmarkEnd w:id="81"/>
-      <w:bookmarkStart w:id="82" w:name="_Toc460849340"/>
+      <w:bookmarkStart w:id="82" w:name="_Toc460681401"/>
       <w:bookmarkEnd w:id="82"/>
       <w:bookmarkStart w:id="83" w:name="_Toc490737735"/>
       <w:bookmarkEnd w:id="83"/>
       <w:bookmarkStart w:id="84" w:name="_Toc460835609"/>
       <w:bookmarkEnd w:id="84"/>
-      <w:bookmarkStart w:id="85" w:name="_Toc490737757"/>
+      <w:bookmarkStart w:id="85" w:name="_Toc460837892"/>
       <w:bookmarkEnd w:id="85"/>
-      <w:bookmarkStart w:id="86" w:name="_Toc460681401"/>
+      <w:bookmarkStart w:id="86" w:name="_Toc460834272"/>
       <w:bookmarkEnd w:id="86"/>
-      <w:bookmarkStart w:id="87" w:name="_Toc16935019"/>
+      <w:bookmarkStart w:id="87" w:name="_Toc490817197"/>
       <w:bookmarkEnd w:id="87"/>
-      <w:bookmarkStart w:id="88" w:name="_Toc490817197"/>
+      <w:bookmarkStart w:id="88" w:name="_Toc76036250"/>
       <w:bookmarkEnd w:id="88"/>
-      <w:bookmarkStart w:id="89" w:name="_Toc13487950"/>
+      <w:bookmarkStart w:id="89" w:name="_Toc202362098"/>
       <w:bookmarkEnd w:id="89"/>
-      <w:bookmarkStart w:id="90" w:name="_Toc11687316"/>
+      <w:bookmarkStart w:id="90" w:name="_Toc490738290"/>
       <w:bookmarkEnd w:id="90"/>
-      <w:bookmarkStart w:id="91" w:name="_Toc202362060"/>
+      <w:bookmarkStart w:id="91" w:name="_Toc490838068"/>
       <w:bookmarkEnd w:id="91"/>
-      <w:bookmarkStart w:id="92" w:name="_Toc76036214"/>
+      <w:bookmarkStart w:id="92" w:name="_Toc490837358"/>
       <w:bookmarkEnd w:id="92"/>
-      <w:bookmarkStart w:id="93" w:name="_Toc490837358"/>
+      <w:bookmarkStart w:id="93" w:name="_Toc11688487"/>
       <w:bookmarkEnd w:id="93"/>
-      <w:bookmarkStart w:id="94" w:name="_Toc184835954"/>
+      <w:bookmarkStart w:id="94" w:name="_Toc76036214"/>
       <w:bookmarkEnd w:id="94"/>
-      <w:bookmarkStart w:id="95" w:name="_Toc76036250"/>
+      <w:bookmarkStart w:id="95" w:name="_Toc16935085"/>
       <w:bookmarkEnd w:id="95"/>
-      <w:bookmarkStart w:id="96" w:name="_Toc490837051"/>
+      <w:bookmarkStart w:id="96" w:name="_Toc184916705"/>
       <w:bookmarkEnd w:id="96"/>
-      <w:bookmarkStart w:id="97" w:name="_Toc16935085"/>
+      <w:bookmarkStart w:id="97" w:name="_Toc184836002"/>
       <w:bookmarkEnd w:id="97"/>
-      <w:bookmarkStart w:id="98" w:name="_Toc184916772"/>
+      <w:bookmarkStart w:id="98" w:name="_Toc490837051"/>
       <w:bookmarkEnd w:id="98"/>
-      <w:bookmarkStart w:id="99" w:name="_Toc490838068"/>
+      <w:bookmarkStart w:id="99" w:name="_Toc490838190"/>
       <w:bookmarkEnd w:id="99"/>
-      <w:bookmarkStart w:id="100" w:name="_Toc490838190"/>
+      <w:bookmarkStart w:id="100" w:name="_Toc13487950"/>
       <w:bookmarkEnd w:id="100"/>
-      <w:bookmarkStart w:id="101" w:name="_Toc184916705"/>
+      <w:bookmarkStart w:id="101" w:name="_Toc11836603"/>
       <w:bookmarkEnd w:id="101"/>
-      <w:bookmarkStart w:id="102" w:name="_Toc202362098"/>
+      <w:bookmarkStart w:id="102" w:name="_Toc184836050"/>
       <w:bookmarkEnd w:id="102"/>
-      <w:bookmarkStart w:id="103" w:name="_Toc11836603"/>
+      <w:bookmarkStart w:id="103" w:name="_Toc490817346"/>
       <w:bookmarkEnd w:id="103"/>
-      <w:bookmarkStart w:id="104" w:name="_Toc13492530"/>
+      <w:bookmarkStart w:id="104" w:name="_Toc184835954"/>
       <w:bookmarkEnd w:id="104"/>
-      <w:bookmarkStart w:id="105" w:name="_Toc11688487"/>
+      <w:bookmarkStart w:id="105" w:name="_Toc13492530"/>
       <w:bookmarkEnd w:id="105"/>
-      <w:bookmarkStart w:id="106" w:name="_Toc490738290"/>
+      <w:bookmarkStart w:id="106" w:name="_Toc16935019"/>
       <w:bookmarkEnd w:id="106"/>
-      <w:bookmarkStart w:id="107" w:name="_Toc184836002"/>
+      <w:bookmarkStart w:id="107" w:name="_Toc184916772"/>
       <w:bookmarkEnd w:id="107"/>
       <w:bookmarkStart w:id="108" w:name="_Toc490837027"/>
       <w:bookmarkEnd w:id="108"/>
-      <w:bookmarkStart w:id="109" w:name="_Toc184836050"/>
+      <w:bookmarkStart w:id="109" w:name="_Toc11687283"/>
       <w:bookmarkEnd w:id="109"/>
-      <w:bookmarkStart w:id="110" w:name="_Toc11687283"/>
+      <w:bookmarkStart w:id="110" w:name="_Toc11687316"/>
       <w:bookmarkEnd w:id="110"/>
-      <w:bookmarkStart w:id="111" w:name="_Toc490817346"/>
+      <w:bookmarkStart w:id="111" w:name="_Toc202362060"/>
       <w:bookmarkEnd w:id="111"/>
     </w:p>
     <w:p>
@@ -6928,23 +6956,23 @@
       <w:bookmarkEnd w:id="112"/>
       <w:bookmarkStart w:id="113" w:name="_Toc460833980"/>
       <w:bookmarkEnd w:id="113"/>
-      <w:bookmarkStart w:id="114" w:name="_Toc460681402"/>
+      <w:bookmarkStart w:id="114" w:name="_Toc460837893"/>
       <w:bookmarkEnd w:id="114"/>
-      <w:bookmarkStart w:id="115" w:name="_Toc460833939"/>
+      <w:bookmarkStart w:id="115" w:name="_Toc460840042"/>
       <w:bookmarkEnd w:id="115"/>
-      <w:bookmarkStart w:id="116" w:name="_Toc460837893"/>
+      <w:bookmarkStart w:id="116" w:name="_Toc460835610"/>
       <w:bookmarkEnd w:id="116"/>
-      <w:bookmarkStart w:id="117" w:name="_Toc460834273"/>
+      <w:bookmarkStart w:id="117" w:name="_Toc490737736"/>
       <w:bookmarkEnd w:id="117"/>
-      <w:bookmarkStart w:id="118" w:name="_Toc460840042"/>
+      <w:bookmarkStart w:id="118" w:name="_Toc490737758"/>
       <w:bookmarkEnd w:id="118"/>
-      <w:bookmarkStart w:id="119" w:name="_Toc460835610"/>
+      <w:bookmarkStart w:id="119" w:name="_Toc460833939"/>
       <w:bookmarkEnd w:id="119"/>
-      <w:bookmarkStart w:id="120" w:name="_Toc460849341"/>
+      <w:bookmarkStart w:id="120" w:name="_Toc460834273"/>
       <w:bookmarkEnd w:id="120"/>
-      <w:bookmarkStart w:id="121" w:name="_Toc490737736"/>
+      <w:bookmarkStart w:id="121" w:name="_Toc460681402"/>
       <w:bookmarkEnd w:id="121"/>
-      <w:bookmarkStart w:id="122" w:name="_Toc490737758"/>
+      <w:bookmarkStart w:id="122" w:name="_Toc460849341"/>
       <w:bookmarkEnd w:id="122"/>
       <w:bookmarkStart w:id="123" w:name="_Toc184836003"/>
       <w:bookmarkEnd w:id="123"/>
@@ -6954,47 +6982,47 @@
       <w:bookmarkEnd w:id="125"/>
       <w:bookmarkStart w:id="126" w:name="_Toc490838191"/>
       <w:bookmarkEnd w:id="126"/>
-      <w:bookmarkStart w:id="127" w:name="_Toc16935020"/>
+      <w:bookmarkStart w:id="127" w:name="_Toc490837052"/>
       <w:bookmarkEnd w:id="127"/>
-      <w:bookmarkStart w:id="128" w:name="_Toc184916706"/>
+      <w:bookmarkStart w:id="128" w:name="_Toc490837359"/>
       <w:bookmarkEnd w:id="128"/>
-      <w:bookmarkStart w:id="129" w:name="_Toc76036251"/>
+      <w:bookmarkStart w:id="129" w:name="_Toc490837028"/>
       <w:bookmarkEnd w:id="129"/>
-      <w:bookmarkStart w:id="130" w:name="_Toc11687317"/>
+      <w:bookmarkStart w:id="130" w:name="_Toc184835955"/>
       <w:bookmarkEnd w:id="130"/>
-      <w:bookmarkStart w:id="131" w:name="_Toc11688488"/>
+      <w:bookmarkStart w:id="131" w:name="_Toc16935020"/>
       <w:bookmarkEnd w:id="131"/>
-      <w:bookmarkStart w:id="132" w:name="_Toc490837028"/>
+      <w:bookmarkStart w:id="132" w:name="_Toc11687317"/>
       <w:bookmarkEnd w:id="132"/>
-      <w:bookmarkStart w:id="133" w:name="_Toc490837052"/>
+      <w:bookmarkStart w:id="133" w:name="_Toc490817347"/>
       <w:bookmarkEnd w:id="133"/>
-      <w:bookmarkStart w:id="134" w:name="_Toc11836604"/>
+      <w:bookmarkStart w:id="134" w:name="_Toc13487951"/>
       <w:bookmarkEnd w:id="134"/>
-      <w:bookmarkStart w:id="135" w:name="_Toc76036215"/>
+      <w:bookmarkStart w:id="135" w:name="_Toc490817198"/>
       <w:bookmarkEnd w:id="135"/>
       <w:bookmarkStart w:id="136" w:name="_Toc184836051"/>
       <w:bookmarkEnd w:id="136"/>
-      <w:bookmarkStart w:id="137" w:name="_Toc184835955"/>
+      <w:bookmarkStart w:id="137" w:name="_Toc13492531"/>
       <w:bookmarkEnd w:id="137"/>
-      <w:bookmarkStart w:id="138" w:name="_Toc202362061"/>
+      <w:bookmarkStart w:id="138" w:name="_Toc11836604"/>
       <w:bookmarkEnd w:id="138"/>
-      <w:bookmarkStart w:id="139" w:name="_Toc11687284"/>
+      <w:bookmarkStart w:id="139" w:name="_Toc76036215"/>
       <w:bookmarkEnd w:id="139"/>
-      <w:bookmarkStart w:id="140" w:name="_Toc490837359"/>
+      <w:bookmarkStart w:id="140" w:name="_Toc76036251"/>
       <w:bookmarkEnd w:id="140"/>
-      <w:bookmarkStart w:id="141" w:name="_Toc490817347"/>
+      <w:bookmarkStart w:id="141" w:name="_Toc11687284"/>
       <w:bookmarkEnd w:id="141"/>
-      <w:bookmarkStart w:id="142" w:name="_Toc490838069"/>
+      <w:bookmarkStart w:id="142" w:name="_Toc16935086"/>
       <w:bookmarkEnd w:id="142"/>
-      <w:bookmarkStart w:id="143" w:name="_Toc13487951"/>
+      <w:bookmarkStart w:id="143" w:name="_Toc490838069"/>
       <w:bookmarkEnd w:id="143"/>
       <w:bookmarkStart w:id="144" w:name="_Toc490738291"/>
       <w:bookmarkEnd w:id="144"/>
-      <w:bookmarkStart w:id="145" w:name="_Toc490817198"/>
+      <w:bookmarkStart w:id="145" w:name="_Toc202362061"/>
       <w:bookmarkEnd w:id="145"/>
-      <w:bookmarkStart w:id="146" w:name="_Toc13492531"/>
+      <w:bookmarkStart w:id="146" w:name="_Toc184916706"/>
       <w:bookmarkEnd w:id="146"/>
-      <w:bookmarkStart w:id="147" w:name="_Toc16935086"/>
+      <w:bookmarkStart w:id="147" w:name="_Toc11688488"/>
       <w:bookmarkEnd w:id="147"/>
     </w:p>
     <w:p>
@@ -7018,77 +7046,77 @@
           <w:szCs w:val="32"/>
         </w:rPr>
       </w:pPr>
-      <w:bookmarkStart w:id="148" w:name="_Toc460681403"/>
+      <w:bookmarkStart w:id="148" w:name="_Toc460835611"/>
       <w:bookmarkEnd w:id="148"/>
-      <w:bookmarkStart w:id="149" w:name="_Toc460833981"/>
+      <w:bookmarkStart w:id="149" w:name="_Toc460849342"/>
       <w:bookmarkEnd w:id="149"/>
-      <w:bookmarkStart w:id="150" w:name="_Toc460835611"/>
+      <w:bookmarkStart w:id="150" w:name="_Toc490738292"/>
       <w:bookmarkEnd w:id="150"/>
-      <w:bookmarkStart w:id="151" w:name="_Toc460849342"/>
+      <w:bookmarkStart w:id="151" w:name="_Toc490737759"/>
       <w:bookmarkEnd w:id="151"/>
-      <w:bookmarkStart w:id="152" w:name="_Toc460833940"/>
+      <w:bookmarkStart w:id="152" w:name="_Toc460681359"/>
       <w:bookmarkEnd w:id="152"/>
-      <w:bookmarkStart w:id="153" w:name="_Toc460840043"/>
+      <w:bookmarkStart w:id="153" w:name="_Toc460837894"/>
       <w:bookmarkEnd w:id="153"/>
-      <w:bookmarkStart w:id="154" w:name="_Toc490737737"/>
+      <w:bookmarkStart w:id="154" w:name="_Toc460833940"/>
       <w:bookmarkEnd w:id="154"/>
-      <w:bookmarkStart w:id="155" w:name="_Toc460834274"/>
+      <w:bookmarkStart w:id="155" w:name="_Toc490737737"/>
       <w:bookmarkEnd w:id="155"/>
-      <w:bookmarkStart w:id="156" w:name="_Toc490737759"/>
+      <w:bookmarkStart w:id="156" w:name="_Toc460834274"/>
       <w:bookmarkEnd w:id="156"/>
-      <w:bookmarkStart w:id="157" w:name="_Toc490738292"/>
+      <w:bookmarkStart w:id="157" w:name="_Toc490817348"/>
       <w:bookmarkEnd w:id="157"/>
-      <w:bookmarkStart w:id="158" w:name="_Toc490817199"/>
+      <w:bookmarkStart w:id="158" w:name="_Toc490837029"/>
       <w:bookmarkEnd w:id="158"/>
-      <w:bookmarkStart w:id="159" w:name="_Toc460681359"/>
+      <w:bookmarkStart w:id="159" w:name="_Toc490817199"/>
       <w:bookmarkEnd w:id="159"/>
-      <w:bookmarkStart w:id="160" w:name="_Toc460837894"/>
+      <w:bookmarkStart w:id="160" w:name="_Toc460833981"/>
       <w:bookmarkEnd w:id="160"/>
-      <w:bookmarkStart w:id="161" w:name="_Toc490817348"/>
+      <w:bookmarkStart w:id="161" w:name="_Toc460840043"/>
       <w:bookmarkEnd w:id="161"/>
-      <w:bookmarkStart w:id="162" w:name="_Toc490837029"/>
+      <w:bookmarkStart w:id="162" w:name="_Toc460681403"/>
       <w:bookmarkEnd w:id="162"/>
-      <w:bookmarkStart w:id="163" w:name="_Toc13487952"/>
+      <w:bookmarkStart w:id="163" w:name="_Toc16935021"/>
       <w:bookmarkEnd w:id="163"/>
-      <w:bookmarkStart w:id="164" w:name="_Toc202362100"/>
+      <w:bookmarkStart w:id="164" w:name="_Toc184836052"/>
       <w:bookmarkEnd w:id="164"/>
-      <w:bookmarkStart w:id="165" w:name="_Toc490837053"/>
+      <w:bookmarkStart w:id="165" w:name="_Toc202362062"/>
       <w:bookmarkEnd w:id="165"/>
-      <w:bookmarkStart w:id="166" w:name="_Toc76036252"/>
+      <w:bookmarkStart w:id="166" w:name="_Toc11836605"/>
       <w:bookmarkEnd w:id="166"/>
-      <w:bookmarkStart w:id="167" w:name="_Toc11836605"/>
+      <w:bookmarkStart w:id="167" w:name="_Toc184916774"/>
       <w:bookmarkEnd w:id="167"/>
-      <w:bookmarkStart w:id="168" w:name="_Toc202362062"/>
+      <w:bookmarkStart w:id="168" w:name="_Toc13487952"/>
       <w:bookmarkEnd w:id="168"/>
-      <w:bookmarkStart w:id="169" w:name="_Toc16935087"/>
+      <w:bookmarkStart w:id="169" w:name="_Toc490838192"/>
       <w:bookmarkEnd w:id="169"/>
-      <w:bookmarkStart w:id="170" w:name="_Toc490838192"/>
+      <w:bookmarkStart w:id="170" w:name="_Toc184836004"/>
       <w:bookmarkEnd w:id="170"/>
-      <w:bookmarkStart w:id="171" w:name="_Toc11687285"/>
+      <w:bookmarkStart w:id="171" w:name="_Toc13492532"/>
       <w:bookmarkEnd w:id="171"/>
-      <w:bookmarkStart w:id="172" w:name="_Toc490838070"/>
+      <w:bookmarkStart w:id="172" w:name="_Toc490837360"/>
       <w:bookmarkEnd w:id="172"/>
-      <w:bookmarkStart w:id="173" w:name="_Toc13492532"/>
+      <w:bookmarkStart w:id="173" w:name="_Toc16935087"/>
       <w:bookmarkEnd w:id="173"/>
       <w:bookmarkStart w:id="174" w:name="_Toc76036216"/>
       <w:bookmarkEnd w:id="174"/>
       <w:bookmarkStart w:id="175" w:name="_Toc11687318"/>
       <w:bookmarkEnd w:id="175"/>
-      <w:bookmarkStart w:id="176" w:name="_Toc184836052"/>
+      <w:bookmarkStart w:id="176" w:name="_Toc490837053"/>
       <w:bookmarkEnd w:id="176"/>
-      <w:bookmarkStart w:id="177" w:name="_Toc184835956"/>
+      <w:bookmarkStart w:id="177" w:name="_Toc202362100"/>
       <w:bookmarkEnd w:id="177"/>
-      <w:bookmarkStart w:id="178" w:name="_Toc184916707"/>
+      <w:bookmarkStart w:id="178" w:name="_Toc184835956"/>
       <w:bookmarkEnd w:id="178"/>
-      <w:bookmarkStart w:id="179" w:name="_Toc11688489"/>
+      <w:bookmarkStart w:id="179" w:name="_Toc76036252"/>
       <w:bookmarkEnd w:id="179"/>
-      <w:bookmarkStart w:id="180" w:name="_Toc490837360"/>
+      <w:bookmarkStart w:id="180" w:name="_Toc11687285"/>
       <w:bookmarkEnd w:id="180"/>
-      <w:bookmarkStart w:id="181" w:name="_Toc184836004"/>
+      <w:bookmarkStart w:id="181" w:name="_Toc490838070"/>
       <w:bookmarkEnd w:id="181"/>
-      <w:bookmarkStart w:id="182" w:name="_Toc16935021"/>
+      <w:bookmarkStart w:id="182" w:name="_Toc184916707"/>
       <w:bookmarkEnd w:id="182"/>
-      <w:bookmarkStart w:id="183" w:name="_Toc184916774"/>
+      <w:bookmarkStart w:id="183" w:name="_Toc11688489"/>
       <w:bookmarkEnd w:id="183"/>
     </w:p>
     <w:p>
@@ -7787,13 +7815,13 @@
         <w:spacing w:before="100" w:beforeAutospacing="1" w:after="100" w:afterAutospacing="1" w:line="240" w:lineRule="auto"/>
       </w:pPr>
       <w:r>
-        <w:t>NA</w:t>
-      </w:r>
-    </w:p>
-    <w:p>
-      <w:pPr>
-        <w:spacing w:before="100" w:beforeAutospacing="1" w:after="100" w:afterAutospacing="1" w:line="240" w:lineRule="auto"/>
-      </w:pPr>
+        <w:rPr>
+          <w:rFonts w:hint="default"/>
+        </w:rPr>
+        <w:t>[[recommendations]]</w:t>
+      </w:r>
+      <w:bookmarkStart w:id="194" w:name="_GoBack"/>
+      <w:bookmarkEnd w:id="194"/>
     </w:p>
     <w:p>
       <w:pPr>
@@ -9614,9 +9642,9 @@
     <w:lsdException w:uiPriority="99" w:name="index 7"/>
     <w:lsdException w:uiPriority="99" w:name="index 8"/>
     <w:lsdException w:uiPriority="99" w:name="index 9"/>
-    <w:lsdException w:uiPriority="39" w:semiHidden="0" w:name="toc 1"/>
-    <w:lsdException w:uiPriority="39" w:semiHidden="0" w:name="toc 2"/>
-    <w:lsdException w:uiPriority="39" w:semiHidden="0" w:name="toc 3"/>
+    <w:lsdException w:qFormat="1" w:uiPriority="39" w:semiHidden="0" w:name="toc 1"/>
+    <w:lsdException w:qFormat="1" w:uiPriority="39" w:semiHidden="0" w:name="toc 2"/>
+    <w:lsdException w:qFormat="1" w:uiPriority="39" w:semiHidden="0" w:name="toc 3"/>
     <w:lsdException w:uiPriority="39" w:name="toc 4"/>
     <w:lsdException w:uiPriority="39" w:name="toc 5"/>
     <w:lsdException w:uiPriority="39" w:name="toc 6"/>
@@ -9625,9 +9653,9 @@
     <w:lsdException w:uiPriority="39" w:name="toc 9"/>
     <w:lsdException w:uiPriority="99" w:name="Normal Indent"/>
     <w:lsdException w:uiPriority="99" w:name="footnote text"/>
-    <w:lsdException w:unhideWhenUsed="0" w:uiPriority="0" w:name="annotation text"/>
-    <w:lsdException w:uiPriority="99" w:semiHidden="0" w:name="header"/>
-    <w:lsdException w:uiPriority="99" w:semiHidden="0" w:name="footer"/>
+    <w:lsdException w:qFormat="1" w:unhideWhenUsed="0" w:uiPriority="0" w:name="annotation text"/>
+    <w:lsdException w:qFormat="1" w:uiPriority="99" w:semiHidden="0" w:name="header"/>
+    <w:lsdException w:qFormat="1" w:uiPriority="99" w:semiHidden="0" w:name="footer"/>
     <w:lsdException w:uiPriority="99" w:name="index heading"/>
     <w:lsdException w:qFormat="1" w:uiPriority="35" w:semiHidden="0" w:name="caption"/>
     <w:lsdException w:uiPriority="99" w:name="table of figures"/>
@@ -9680,14 +9708,14 @@
     <w:lsdException w:uiPriority="99" w:name="Body Text Indent 2"/>
     <w:lsdException w:uiPriority="99" w:name="Body Text Indent 3"/>
     <w:lsdException w:uiPriority="99" w:name="Block Text"/>
-    <w:lsdException w:uiPriority="99" w:semiHidden="0" w:name="Hyperlink"/>
+    <w:lsdException w:qFormat="1" w:uiPriority="99" w:semiHidden="0" w:name="Hyperlink"/>
     <w:lsdException w:uiPriority="99" w:name="FollowedHyperlink"/>
     <w:lsdException w:qFormat="1" w:unhideWhenUsed="0" w:uiPriority="22" w:semiHidden="0" w:name="Strong"/>
     <w:lsdException w:qFormat="1" w:unhideWhenUsed="0" w:uiPriority="20" w:semiHidden="0" w:name="Emphasis"/>
-    <w:lsdException w:uiPriority="99" w:name="Document Map"/>
+    <w:lsdException w:qFormat="1" w:uiPriority="99" w:name="Document Map"/>
     <w:lsdException w:uiPriority="99" w:name="Plain Text"/>
     <w:lsdException w:uiPriority="99" w:name="E-mail Signature"/>
-    <w:lsdException w:uiPriority="99" w:semiHidden="0" w:name="Normal (Web)"/>
+    <w:lsdException w:qFormat="1" w:uiPriority="99" w:semiHidden="0" w:name="Normal (Web)"/>
     <w:lsdException w:uiPriority="99" w:name="HTML Acronym"/>
     <w:lsdException w:uiPriority="99" w:name="HTML Address"/>
     <w:lsdException w:uiPriority="99" w:name="HTML Cite"/>
@@ -9742,7 +9770,7 @@
     <w:lsdException w:uiPriority="99" w:name="Table Web 1"/>
     <w:lsdException w:uiPriority="99" w:name="Table Web 2"/>
     <w:lsdException w:uiPriority="99" w:name="Table Web 3"/>
-    <w:lsdException w:uiPriority="99" w:name="Balloon Text"/>
+    <w:lsdException w:qFormat="1" w:uiPriority="99" w:name="Balloon Text"/>
     <w:lsdException w:qFormat="1" w:unhideWhenUsed="0" w:uiPriority="0" w:semiHidden="0" w:name="Table Grid"/>
     <w:lsdException w:uiPriority="99" w:name="Table Theme"/>
     <w:lsdException w:qFormat="1" w:unhideWhenUsed="0" w:uiPriority="1" w:semiHidden="0" w:name="No Spacing"/>
@@ -10085,6 +10113,7 @@
     <w:link w:val="65"/>
     <w:semiHidden/>
     <w:unhideWhenUsed/>
+    <w:qFormat/>
     <w:uiPriority w:val="99"/>
     <w:pPr>
       <w:spacing w:after="0" w:line="240" w:lineRule="auto"/>
@@ -10131,6 +10160,7 @@
     <w:basedOn w:val="1"/>
     <w:link w:val="40"/>
     <w:semiHidden/>
+    <w:qFormat/>
     <w:uiPriority w:val="0"/>
     <w:pPr>
       <w:bidi/>
@@ -10149,6 +10179,7 @@
     <w:link w:val="67"/>
     <w:semiHidden/>
     <w:unhideWhenUsed/>
+    <w:qFormat/>
     <w:uiPriority w:val="99"/>
     <w:pPr>
       <w:spacing w:after="0" w:line="240" w:lineRule="auto"/>
@@ -10174,6 +10205,7 @@
     <w:basedOn w:val="1"/>
     <w:link w:val="39"/>
     <w:unhideWhenUsed/>
+    <w:qFormat/>
     <w:uiPriority w:val="99"/>
     <w:pPr>
       <w:tabs>
@@ -10188,6 +10220,7 @@
     <w:basedOn w:val="1"/>
     <w:link w:val="38"/>
     <w:unhideWhenUsed/>
+    <w:qFormat/>
     <w:uiPriority w:val="99"/>
     <w:pPr>
       <w:tabs>
@@ -10201,6 +10234,7 @@
     <w:name w:val="Hyperlink"/>
     <w:basedOn w:val="11"/>
     <w:unhideWhenUsed/>
+    <w:qFormat/>
     <w:uiPriority w:val="99"/>
     <w:rPr>
       <w:color w:val="0563C1" w:themeColor="hyperlink"/>
@@ -10216,6 +10250,7 @@
     <w:name w:val="Normal (Web)"/>
     <w:basedOn w:val="1"/>
     <w:unhideWhenUsed/>
+    <w:qFormat/>
     <w:uiPriority w:val="99"/>
     <w:pPr>
       <w:spacing w:before="100" w:beforeAutospacing="1" w:after="100" w:afterAutospacing="1" w:line="240" w:lineRule="auto"/>
@@ -10313,6 +10348,7 @@
     <w:next w:val="1"/>
     <w:autoRedefine/>
     <w:unhideWhenUsed/>
+    <w:qFormat/>
     <w:uiPriority w:val="39"/>
     <w:pPr>
       <w:spacing w:after="100"/>
@@ -10324,6 +10360,7 @@
     <w:next w:val="1"/>
     <w:autoRedefine/>
     <w:unhideWhenUsed/>
+    <w:qFormat/>
     <w:uiPriority w:val="39"/>
     <w:pPr>
       <w:spacing w:after="100"/>
@@ -10336,6 +10373,7 @@
     <w:next w:val="1"/>
     <w:autoRedefine/>
     <w:unhideWhenUsed/>
+    <w:qFormat/>
     <w:uiPriority w:val="39"/>
     <w:pPr>
       <w:spacing w:after="100"/>
@@ -10440,6 +10478,7 @@
     <w:name w:val="Heading 2 Char"/>
     <w:basedOn w:val="11"/>
     <w:link w:val="3"/>
+    <w:qFormat/>
     <w:uiPriority w:val="9"/>
     <w:rPr>
       <w:rFonts w:eastAsiaTheme="majorEastAsia" w:cstheme="majorBidi"/>
@@ -10452,12 +10491,14 @@
     <w:name w:val="Header Char"/>
     <w:basedOn w:val="11"/>
     <w:link w:val="20"/>
+    <w:qFormat/>
     <w:uiPriority w:val="99"/>
   </w:style>
   <w:style w:type="character" w:customStyle="1" w:styleId="39">
     <w:name w:val="Footer Char"/>
     <w:basedOn w:val="11"/>
     <w:link w:val="19"/>
+    <w:qFormat/>
     <w:uiPriority w:val="99"/>
   </w:style>
   <w:style w:type="character" w:customStyle="1" w:styleId="40">
@@ -10465,6 +10506,7 @@
     <w:basedOn w:val="11"/>
     <w:link w:val="16"/>
     <w:semiHidden/>
+    <w:qFormat/>
     <w:uiPriority w:val="0"/>
     <w:rPr>
       <w:rFonts w:ascii="Times New Roman" w:hAnsi="Times New Roman" w:eastAsia="Times New Roman" w:cs="Times New Roman"/>
@@ -10476,6 +10518,7 @@
   <w:style w:type="paragraph" w:customStyle="1" w:styleId="41">
     <w:name w:val="Bullet list"/>
     <w:basedOn w:val="1"/>
+    <w:qFormat/>
     <w:uiPriority w:val="0"/>
     <w:pPr>
       <w:keepLines/>
@@ -10495,6 +10538,7 @@
     <w:name w:val="Heading 3 Char"/>
     <w:basedOn w:val="11"/>
     <w:link w:val="4"/>
+    <w:qFormat/>
     <w:uiPriority w:val="9"/>
     <w:rPr>
       <w:rFonts w:eastAsiaTheme="majorEastAsia" w:cstheme="majorBidi"/>
@@ -10518,6 +10562,7 @@
     <w:name w:val="Heading 4 Char"/>
     <w:basedOn w:val="11"/>
     <w:link w:val="5"/>
+    <w:qFormat/>
     <w:uiPriority w:val="9"/>
     <w:rPr>
       <w:rFonts w:asciiTheme="majorHAnsi" w:hAnsiTheme="majorHAnsi" w:eastAsiaTheme="majorEastAsia" w:cstheme="majorBidi"/>
@@ -10531,6 +10576,7 @@
     <w:basedOn w:val="11"/>
     <w:link w:val="6"/>
     <w:semiHidden/>
+    <w:qFormat/>
     <w:uiPriority w:val="9"/>
     <w:rPr>
       <w:rFonts w:asciiTheme="majorHAnsi" w:hAnsiTheme="majorHAnsi" w:eastAsiaTheme="majorEastAsia" w:cstheme="majorBidi"/>
@@ -10543,6 +10589,7 @@
     <w:basedOn w:val="11"/>
     <w:link w:val="7"/>
     <w:semiHidden/>
+    <w:qFormat/>
     <w:uiPriority w:val="9"/>
     <w:rPr>
       <w:rFonts w:asciiTheme="majorHAnsi" w:hAnsiTheme="majorHAnsi" w:eastAsiaTheme="majorEastAsia" w:cstheme="majorBidi"/>
@@ -10557,6 +10604,7 @@
     <w:basedOn w:val="11"/>
     <w:link w:val="8"/>
     <w:semiHidden/>
+    <w:qFormat/>
     <w:uiPriority w:val="9"/>
     <w:rPr>
       <w:rFonts w:asciiTheme="majorHAnsi" w:hAnsiTheme="majorHAnsi" w:eastAsiaTheme="majorEastAsia" w:cstheme="majorBidi"/>
@@ -10570,6 +10618,7 @@
     <w:basedOn w:val="11"/>
     <w:link w:val="9"/>
     <w:semiHidden/>
+    <w:qFormat/>
     <w:uiPriority w:val="9"/>
     <w:rPr>
       <w:rFonts w:asciiTheme="majorHAnsi" w:hAnsiTheme="majorHAnsi" w:eastAsiaTheme="majorEastAsia" w:cstheme="majorBidi"/>
@@ -10585,6 +10634,7 @@
     <w:basedOn w:val="11"/>
     <w:link w:val="10"/>
     <w:semiHidden/>
+    <w:qFormat/>
     <w:uiPriority w:val="9"/>
     <w:rPr>
       <w:rFonts w:asciiTheme="majorHAnsi" w:hAnsiTheme="majorHAnsi" w:eastAsiaTheme="majorEastAsia" w:cstheme="majorBidi"/>
@@ -10597,6 +10647,7 @@
     <w:name w:val="Title Char"/>
     <w:basedOn w:val="11"/>
     <w:link w:val="26"/>
+    <w:qFormat/>
     <w:uiPriority w:val="10"/>
     <w:rPr>
       <w:rFonts w:asciiTheme="majorHAnsi" w:hAnsiTheme="majorHAnsi" w:eastAsiaTheme="majorEastAsia" w:cstheme="majorBidi"/>
@@ -10616,6 +10667,7 @@
     <w:name w:val="Subtitle Char"/>
     <w:basedOn w:val="11"/>
     <w:link w:val="24"/>
+    <w:qFormat/>
     <w:uiPriority w:val="11"/>
     <w:rPr>
       <w:rFonts w:asciiTheme="majorHAnsi" w:hAnsiTheme="majorHAnsi" w:eastAsiaTheme="majorEastAsia" w:cstheme="majorBidi"/>
@@ -10655,6 +10707,7 @@
     <w:name w:val="Quote Char"/>
     <w:basedOn w:val="11"/>
     <w:link w:val="52"/>
+    <w:qFormat/>
     <w:uiPriority w:val="29"/>
     <w:rPr>
       <w:color w:val="44546A" w:themeColor="text2"/>
@@ -10696,6 +10749,7 @@
     <w:name w:val="Intense Quote Char"/>
     <w:basedOn w:val="11"/>
     <w:link w:val="54"/>
+    <w:qFormat/>
     <w:uiPriority w:val="30"/>
     <w:rPr>
       <w:rFonts w:asciiTheme="majorHAnsi" w:hAnsiTheme="majorHAnsi" w:eastAsiaTheme="majorEastAsia" w:cstheme="majorBidi"/>
@@ -10815,6 +10869,7 @@
   <w:style w:type="table" w:customStyle="1" w:styleId="62">
     <w:name w:val="Grid Table 41"/>
     <w:basedOn w:val="12"/>
+    <w:qFormat/>
     <w:uiPriority w:val="49"/>
     <w:pPr>
       <w:spacing w:after="0" w:line="240" w:lineRule="auto"/>
@@ -10889,6 +10944,7 @@
   <w:style w:type="table" w:customStyle="1" w:styleId="63">
     <w:name w:val="List Table 31"/>
     <w:basedOn w:val="12"/>
+    <w:qFormat/>
     <w:uiPriority w:val="48"/>
     <w:pPr>
       <w:spacing w:after="0" w:line="240" w:lineRule="auto"/>
@@ -11005,6 +11061,7 @@
   <w:style w:type="table" w:customStyle="1" w:styleId="64">
     <w:name w:val="List Table 3 - Accent 11"/>
     <w:basedOn w:val="12"/>
+    <w:qFormat/>
     <w:uiPriority w:val="48"/>
     <w:pPr>
       <w:spacing w:after="0" w:line="240" w:lineRule="auto"/>
@@ -11123,6 +11180,7 @@
     <w:basedOn w:val="11"/>
     <w:link w:val="13"/>
     <w:semiHidden/>
+    <w:qFormat/>
     <w:uiPriority w:val="99"/>
     <w:rPr>
       <w:rFonts w:ascii="Tahoma" w:hAnsi="Tahoma" w:cs="Tahoma"/>
@@ -11133,6 +11191,7 @@
   <w:style w:type="character" w:customStyle="1" w:styleId="66">
     <w:name w:val="ui-provider"/>
     <w:basedOn w:val="11"/>
+    <w:qFormat/>
     <w:uiPriority w:val="0"/>
   </w:style>
   <w:style w:type="character" w:customStyle="1" w:styleId="67">
@@ -11140,6 +11199,7 @@
     <w:basedOn w:val="11"/>
     <w:link w:val="17"/>
     <w:semiHidden/>
+    <w:qFormat/>
     <w:uiPriority w:val="99"/>
     <w:rPr>
       <w:rFonts w:ascii="Tahoma" w:hAnsi="Tahoma" w:cs="Tahoma"/>
@@ -11159,6 +11219,7 @@
     <w:basedOn w:val="11"/>
     <w:semiHidden/>
     <w:unhideWhenUsed/>
+    <w:qFormat/>
     <w:uiPriority w:val="99"/>
     <w:rPr>
       <w:color w:val="605E5C"/>
@@ -11433,6 +11494,36 @@
 </file>
 
 <file path=customXml/item2.xml><?xml version="1.0" encoding="utf-8"?>
+<CoverPageProperties xmlns="http://schemas.microsoft.com/office/2006/coverPageProps">
+  <PublishDate>2016-09-02T00:00:00</PublishDate>
+  <Abstract/>
+  <CompanyAddress/>
+  <CompanyPhone/>
+  <CompanyFax/>
+  <CompanyEmail/>
+</CoverPageProperties>
+</file>
+
+<file path=customXml/item3.xml><?xml version="1.0" encoding="utf-8"?>
+<b:Sources xmlns:b="http://schemas.openxmlformats.org/officeDocument/2006/bibliography" xmlns="http://schemas.openxmlformats.org/officeDocument/2006/bibliography" SelectedStyle="\APASixthEditionOfficeOnline.xsl" StyleName="APA" Version="6"/>
+</file>
+
+<file path=customXml/item4.xml><?xml version="1.0" encoding="utf-8"?>
+<p:properties xmlns:p="http://schemas.microsoft.com/office/2006/metadata/properties" xmlns:xsi="http://www.w3.org/2001/XMLSchema-instance" xmlns:pc="http://schemas.microsoft.com/office/infopath/2007/PartnerControls">
+  <documentManagement/>
+</p:properties>
+</file>
+
+<file path=customXml/item5.xml><?xml version="1.0" encoding="utf-8"?>
+<?mso-contentType ?>
+<FormTemplates xmlns="http://schemas.microsoft.com/sharepoint/v3/contenttype/forms">
+  <Display>DocumentLibraryForm</Display>
+  <Edit>DocumentLibraryForm</Edit>
+  <New>DocumentLibraryForm</New>
+</FormTemplates>
+</file>
+
+<file path=customXml/item6.xml><?xml version="1.0" encoding="utf-8"?>
 <ct:contentTypeSchema xmlns:ct="http://schemas.microsoft.com/office/2006/metadata/contentType" xmlns:ma="http://schemas.microsoft.com/office/2006/metadata/properties/metaAttributes" ct:_="" ma:_="" ma:contentTypeName="Document" ma:contentTypeID="0x010100020D9BBBAF2E6941ABF04760C39BE342" ma:contentTypeVersion="5" ma:contentTypeDescription="Create a new document." ma:contentTypeScope="" ma:versionID="74795dd854a2b0d097875cca1f7b5eb5">
   <xsd:schema xmlns:xsd="http://www.w3.org/2001/XMLSchema" xmlns:xs="http://www.w3.org/2001/XMLSchema" xmlns:p="http://schemas.microsoft.com/office/2006/metadata/properties" xmlns:ns2="e4483c6f-5c1c-4c4e-b51a-a796de96c87c" targetNamespace="http://schemas.microsoft.com/office/2006/metadata/properties" ma:root="true" ma:fieldsID="ff4f1328a6194c7238c33da23fedc339" ns2:_="">
     <xsd:import namespace="e4483c6f-5c1c-4c4e-b51a-a796de96c87c"/>
@@ -11584,36 +11675,6 @@
 </ct:contentTypeSchema>
 </file>
 
-<file path=customXml/item3.xml><?xml version="1.0" encoding="utf-8"?>
-<?mso-contentType ?>
-<FormTemplates xmlns="http://schemas.microsoft.com/sharepoint/v3/contenttype/forms">
-  <Display>DocumentLibraryForm</Display>
-  <Edit>DocumentLibraryForm</Edit>
-  <New>DocumentLibraryForm</New>
-</FormTemplates>
-</file>
-
-<file path=customXml/item4.xml><?xml version="1.0" encoding="utf-8"?>
-<p:properties xmlns:p="http://schemas.microsoft.com/office/2006/metadata/properties" xmlns:xsi="http://www.w3.org/2001/XMLSchema-instance" xmlns:pc="http://schemas.microsoft.com/office/infopath/2007/PartnerControls">
-  <documentManagement/>
-</p:properties>
-</file>
-
-<file path=customXml/item5.xml><?xml version="1.0" encoding="utf-8"?>
-<b:Sources xmlns:b="http://schemas.openxmlformats.org/officeDocument/2006/bibliography" xmlns="http://schemas.openxmlformats.org/officeDocument/2006/bibliography" SelectedStyle="\APASixthEditionOfficeOnline.xsl" StyleName="APA" Version="6"/>
-</file>
-
-<file path=customXml/item6.xml><?xml version="1.0" encoding="utf-8"?>
-<CoverPageProperties xmlns="http://schemas.microsoft.com/office/2006/coverPageProps">
-  <PublishDate>2016-09-02T00:00:00</PublishDate>
-  <Abstract/>
-  <CompanyAddress/>
-  <CompanyPhone/>
-  <CompanyFax/>
-  <CompanyEmail/>
-</CoverPageProperties>
-</file>
-
 <file path=customXml/itemProps1.xml><?xml version="1.0" encoding="utf-8"?>
 <ds:datastoreItem xmlns:ds="http://schemas.openxmlformats.org/officeDocument/2006/customXml" ds:itemID="{B1977F7D-205B-4081-913C-38D41E755F92}">
   <ds:schemaRefs>
@@ -11623,13 +11684,13 @@
 </file>
 
 <file path=customXml/itemProps2.xml><?xml version="1.0" encoding="utf-8"?>
-<ds:datastoreItem xmlns:ds="http://schemas.openxmlformats.org/officeDocument/2006/customXml" ds:itemID="{CBFF6E32-0B21-4E5C-9A6D-AC02DD3437C8}">
+<ds:datastoreItem xmlns:ds="http://schemas.openxmlformats.org/officeDocument/2006/customXml" ds:itemID="{55AF091B-3C7A-41E3-B477-F2FDAA23CFDA}">
   <ds:schemaRefs/>
 </ds:datastoreItem>
 </file>
 
 <file path=customXml/itemProps3.xml><?xml version="1.0" encoding="utf-8"?>
-<ds:datastoreItem xmlns:ds="http://schemas.openxmlformats.org/officeDocument/2006/customXml" ds:itemID="{B23E2C85-2B27-4CEB-9A38-2341BEDC7BCB}">
+<ds:datastoreItem xmlns:ds="http://schemas.openxmlformats.org/officeDocument/2006/customXml" ds:itemID="{895E864E-0398-45E1-97CF-17C9309682F2}">
   <ds:schemaRefs/>
 </ds:datastoreItem>
 </file>
@@ -11641,13 +11702,13 @@
 </file>
 
 <file path=customXml/itemProps5.xml><?xml version="1.0" encoding="utf-8"?>
-<ds:datastoreItem xmlns:ds="http://schemas.openxmlformats.org/officeDocument/2006/customXml" ds:itemID="{895E864E-0398-45E1-97CF-17C9309682F2}">
+<ds:datastoreItem xmlns:ds="http://schemas.openxmlformats.org/officeDocument/2006/customXml" ds:itemID="{B23E2C85-2B27-4CEB-9A38-2341BEDC7BCB}">
   <ds:schemaRefs/>
 </ds:datastoreItem>
 </file>
 
 <file path=customXml/itemProps6.xml><?xml version="1.0" encoding="utf-8"?>
-<ds:datastoreItem xmlns:ds="http://schemas.openxmlformats.org/officeDocument/2006/customXml" ds:itemID="{55AF091B-3C7A-41E3-B477-F2FDAA23CFDA}">
+<ds:datastoreItem xmlns:ds="http://schemas.openxmlformats.org/officeDocument/2006/customXml" ds:itemID="{CBFF6E32-0B21-4E5C-9A6D-AC02DD3437C8}">
   <ds:schemaRefs/>
 </ds:datastoreItem>
 </file>
</xml_diff>